<commit_message>
Struktura HTML - część 2
</commit_message>
<xml_diff>
--- a/Projekt dynamicznej strony HTML i CSS.docx
+++ b/Projekt dynamicznej strony HTML i CSS.docx
@@ -7,13 +7,7 @@
         <w:pStyle w:val="Nagwek1"/>
       </w:pPr>
       <w:r>
-        <w:t xml:space="preserve">Projekt </w:t>
-      </w:r>
-      <w:r>
-        <w:t xml:space="preserve">dynamicznej strony </w:t>
-      </w:r>
-      <w:r>
-        <w:t>HTML i CSS</w:t>
+        <w:t>Projekt dynamicznej strony HTML i CSS</w:t>
       </w:r>
     </w:p>
     <w:p>
@@ -52,8 +46,64 @@
       <w:pPr>
         <w:pStyle w:val="Bezodstpw"/>
       </w:pPr>
-      <w:r>
-        <w:t>Stworzenie repozytorium na GitHub</w:t>
+    </w:p>
+    <w:p>
+      <w:r>
+        <w:t>Początkowa struktura HTML projektu</w:t>
+      </w:r>
+      <w:r>
+        <w:t>. Stworzenie plików index.html i style.css.</w:t>
+      </w:r>
+      <w:r>
+        <w:t xml:space="preserve"> Dodanie </w:t>
+      </w:r>
+      <w:r>
+        <w:t xml:space="preserve">odniesienia </w:t>
+      </w:r>
+      <w:r>
+        <w:t>styli w kodzie html.</w:t>
+      </w:r>
+      <w:r>
+        <w:t xml:space="preserve"> </w:t>
+      </w:r>
+    </w:p>
+    <w:p>
+      <w:r>
+        <w:drawing>
+          <wp:inline distT="0" distB="0" distL="0" distR="0" wp14:anchorId="2F919EF8" wp14:editId="77886D09">
+            <wp:extent cx="5731510" cy="2314575"/>
+            <wp:effectExtent l="0" t="0" r="2540" b="9525"/>
+            <wp:docPr id="2088579606" name="Obraz 1"/>
+            <wp:cNvGraphicFramePr>
+              <a:graphicFrameLocks xmlns:a="http://schemas.openxmlformats.org/drawingml/2006/main" noChangeAspect="1"/>
+            </wp:cNvGraphicFramePr>
+            <a:graphic xmlns:a="http://schemas.openxmlformats.org/drawingml/2006/main">
+              <a:graphicData uri="http://schemas.openxmlformats.org/drawingml/2006/picture">
+                <pic:pic xmlns:pic="http://schemas.openxmlformats.org/drawingml/2006/picture">
+                  <pic:nvPicPr>
+                    <pic:cNvPr id="2088579606" name=""/>
+                    <pic:cNvPicPr/>
+                  </pic:nvPicPr>
+                  <pic:blipFill>
+                    <a:blip r:embed="rId4"/>
+                    <a:stretch>
+                      <a:fillRect/>
+                    </a:stretch>
+                  </pic:blipFill>
+                  <pic:spPr>
+                    <a:xfrm>
+                      <a:off x="0" y="0"/>
+                      <a:ext cx="5731510" cy="2314575"/>
+                    </a:xfrm>
+                    <a:prstGeom prst="rect">
+                      <a:avLst/>
+                    </a:prstGeom>
+                  </pic:spPr>
+                </pic:pic>
+              </a:graphicData>
+            </a:graphic>
+          </wp:inline>
+        </w:drawing>
       </w:r>
     </w:p>
     <w:p>
@@ -62,7 +112,23 @@
       </w:pPr>
     </w:p>
     <w:p>
-      <w:r>
+      <w:pPr>
+        <w:pStyle w:val="Bezodstpw"/>
+      </w:pPr>
+      <w:r>
+        <w:t>Stworzenie repozytorium na GitHub</w:t>
+      </w:r>
+    </w:p>
+    <w:p>
+      <w:pPr>
+        <w:pStyle w:val="Bezodstpw"/>
+      </w:pPr>
+    </w:p>
+    <w:p>
+      <w:r>
+        <w:rPr>
+          <w:noProof/>
+        </w:rPr>
         <w:drawing>
           <wp:inline distT="0" distB="0" distL="0" distR="0" wp14:anchorId="2195A1D9" wp14:editId="6488B7AC">
             <wp:extent cx="5130800" cy="2536978"/>
@@ -79,7 +145,7 @@
                     <pic:cNvPicPr/>
                   </pic:nvPicPr>
                   <pic:blipFill>
-                    <a:blip r:embed="rId4"/>
+                    <a:blip r:embed="rId5"/>
                     <a:stretch>
                       <a:fillRect/>
                     </a:stretch>
@@ -102,27 +168,20 @@
     </w:p>
     <w:p>
       <w:r>
-        <w:t xml:space="preserve">Założenie drugiego </w:t>
-      </w:r>
-      <w:proofErr w:type="spellStart"/>
-      <w:r>
-        <w:t>brancha</w:t>
-      </w:r>
-      <w:proofErr w:type="spellEnd"/>
-      <w:r>
-        <w:t xml:space="preserve"> </w:t>
-      </w:r>
-      <w:proofErr w:type="spellStart"/>
-      <w:r>
-        <w:t>develop</w:t>
-      </w:r>
-      <w:proofErr w:type="spellEnd"/>
-      <w:r>
-        <w:t xml:space="preserve"> – dodanie pliku README.md</w:t>
-      </w:r>
-    </w:p>
-    <w:p>
-      <w:r>
+        <w:br w:type="page"/>
+      </w:r>
+    </w:p>
+    <w:p/>
+    <w:p>
+      <w:r>
+        <w:t>Założenie drugiego brancha develop – dodanie pliku README.md</w:t>
+      </w:r>
+    </w:p>
+    <w:p>
+      <w:r>
+        <w:rPr>
+          <w:noProof/>
+        </w:rPr>
         <w:drawing>
           <wp:inline distT="0" distB="0" distL="0" distR="0" wp14:anchorId="5484BCE6" wp14:editId="34E544D3">
             <wp:extent cx="5130800" cy="4004707"/>
@@ -139,7 +198,7 @@
                     <pic:cNvPicPr/>
                   </pic:nvPicPr>
                   <pic:blipFill>
-                    <a:blip r:embed="rId5"/>
+                    <a:blip r:embed="rId6"/>
                     <a:stretch>
                       <a:fillRect/>
                     </a:stretch>
@@ -160,7 +219,97 @@
         </w:drawing>
       </w:r>
     </w:p>
+    <w:p>
+      <w:r>
+        <w:t>Uruchomienie Live Server do podglądu strony:</w:t>
+      </w:r>
+    </w:p>
+    <w:p>
+      <w:r>
+        <w:drawing>
+          <wp:inline distT="0" distB="0" distL="0" distR="0" wp14:anchorId="4EABEDCB" wp14:editId="28D3095F">
+            <wp:extent cx="5731510" cy="3089275"/>
+            <wp:effectExtent l="0" t="0" r="2540" b="0"/>
+            <wp:docPr id="1880741007" name="Obraz 1"/>
+            <wp:cNvGraphicFramePr>
+              <a:graphicFrameLocks xmlns:a="http://schemas.openxmlformats.org/drawingml/2006/main" noChangeAspect="1"/>
+            </wp:cNvGraphicFramePr>
+            <a:graphic xmlns:a="http://schemas.openxmlformats.org/drawingml/2006/main">
+              <a:graphicData uri="http://schemas.openxmlformats.org/drawingml/2006/picture">
+                <pic:pic xmlns:pic="http://schemas.openxmlformats.org/drawingml/2006/picture">
+                  <pic:nvPicPr>
+                    <pic:cNvPr id="1880741007" name=""/>
+                    <pic:cNvPicPr/>
+                  </pic:nvPicPr>
+                  <pic:blipFill>
+                    <a:blip r:embed="rId7"/>
+                    <a:stretch>
+                      <a:fillRect/>
+                    </a:stretch>
+                  </pic:blipFill>
+                  <pic:spPr>
+                    <a:xfrm>
+                      <a:off x="0" y="0"/>
+                      <a:ext cx="5731510" cy="3089275"/>
+                    </a:xfrm>
+                    <a:prstGeom prst="rect">
+                      <a:avLst/>
+                    </a:prstGeom>
+                  </pic:spPr>
+                </pic:pic>
+              </a:graphicData>
+            </a:graphic>
+          </wp:inline>
+        </w:drawing>
+      </w:r>
+    </w:p>
     <w:p/>
+    <w:p/>
+    <w:p>
+      <w:r>
+        <w:lastRenderedPageBreak/>
+        <w:t>Dodanie nagłówka strony, menu</w:t>
+      </w:r>
+    </w:p>
+    <w:p>
+      <w:r>
+        <w:drawing>
+          <wp:inline distT="0" distB="0" distL="0" distR="0" wp14:anchorId="169DA3A0" wp14:editId="34137B5D">
+            <wp:extent cx="5731510" cy="2096135"/>
+            <wp:effectExtent l="0" t="0" r="2540" b="0"/>
+            <wp:docPr id="1570412780" name="Obraz 1"/>
+            <wp:cNvGraphicFramePr>
+              <a:graphicFrameLocks xmlns:a="http://schemas.openxmlformats.org/drawingml/2006/main" noChangeAspect="1"/>
+            </wp:cNvGraphicFramePr>
+            <a:graphic xmlns:a="http://schemas.openxmlformats.org/drawingml/2006/main">
+              <a:graphicData uri="http://schemas.openxmlformats.org/drawingml/2006/picture">
+                <pic:pic xmlns:pic="http://schemas.openxmlformats.org/drawingml/2006/picture">
+                  <pic:nvPicPr>
+                    <pic:cNvPr id="1570412780" name=""/>
+                    <pic:cNvPicPr/>
+                  </pic:nvPicPr>
+                  <pic:blipFill>
+                    <a:blip r:embed="rId8"/>
+                    <a:stretch>
+                      <a:fillRect/>
+                    </a:stretch>
+                  </pic:blipFill>
+                  <pic:spPr>
+                    <a:xfrm>
+                      <a:off x="0" y="0"/>
+                      <a:ext cx="5731510" cy="2096135"/>
+                    </a:xfrm>
+                    <a:prstGeom prst="rect">
+                      <a:avLst/>
+                    </a:prstGeom>
+                  </pic:spPr>
+                </pic:pic>
+              </a:graphicData>
+            </a:graphic>
+          </wp:inline>
+        </w:drawing>
+      </w:r>
+    </w:p>
     <w:sectPr>
       <w:pgSz w:w="11906" w:h="16838"/>
       <w:pgMar w:top="1440" w:right="1440" w:bottom="1440" w:left="1440" w:header="708" w:footer="708" w:gutter="0"/>

</xml_diff>

<commit_message>
.Dodanie efektu hover na menu .Dodanie transition na kartach .Dodanie animacji fade-in
</commit_message>
<xml_diff>
--- a/Projekt dynamicznej strony HTML i CSS.docx
+++ b/Projekt dynamicznej strony HTML i CSS.docx
@@ -93,7 +93,7 @@
                     <pic:cNvPicPr/>
                   </pic:nvPicPr>
                   <pic:blipFill>
-                    <a:blip r:embed="rId4"/>
+                    <a:blip r:embed="rId5"/>
                     <a:stretch>
                       <a:fillRect/>
                     </a:stretch>
@@ -153,7 +153,7 @@
                     <pic:cNvPicPr/>
                   </pic:nvPicPr>
                   <pic:blipFill>
-                    <a:blip r:embed="rId5"/>
+                    <a:blip r:embed="rId6"/>
                     <a:stretch>
                       <a:fillRect/>
                     </a:stretch>
@@ -222,7 +222,7 @@
                     <pic:cNvPicPr/>
                   </pic:nvPicPr>
                   <pic:blipFill>
-                    <a:blip r:embed="rId6"/>
+                    <a:blip r:embed="rId7"/>
                     <a:stretch>
                       <a:fillRect/>
                     </a:stretch>
@@ -266,7 +266,7 @@
                     <pic:cNvPicPr/>
                   </pic:nvPicPr>
                   <pic:blipFill>
-                    <a:blip r:embed="rId7"/>
+                    <a:blip r:embed="rId8"/>
                     <a:stretch>
                       <a:fillRect/>
                     </a:stretch>
@@ -313,7 +313,7 @@
                     <pic:cNvPicPr/>
                   </pic:nvPicPr>
                   <pic:blipFill>
-                    <a:blip r:embed="rId8"/>
+                    <a:blip r:embed="rId9"/>
                     <a:stretch>
                       <a:fillRect/>
                     </a:stretch>
@@ -377,7 +377,7 @@
                     <pic:cNvPicPr/>
                   </pic:nvPicPr>
                   <pic:blipFill>
-                    <a:blip r:embed="rId9"/>
+                    <a:blip r:embed="rId10"/>
                     <a:stretch>
                       <a:fillRect/>
                     </a:stretch>
@@ -437,7 +437,7 @@
                     <pic:cNvPicPr/>
                   </pic:nvPicPr>
                   <pic:blipFill>
-                    <a:blip r:embed="rId10"/>
+                    <a:blip r:embed="rId11"/>
                     <a:stretch>
                       <a:fillRect/>
                     </a:stretch>
@@ -498,7 +498,7 @@
                     <pic:cNvPicPr/>
                   </pic:nvPicPr>
                   <pic:blipFill>
-                    <a:blip r:embed="rId11"/>
+                    <a:blip r:embed="rId12"/>
                     <a:stretch>
                       <a:fillRect/>
                     </a:stretch>
@@ -541,7 +541,7 @@
                     <pic:cNvPicPr/>
                   </pic:nvPicPr>
                   <pic:blipFill>
-                    <a:blip r:embed="rId12"/>
+                    <a:blip r:embed="rId13"/>
                     <a:stretch>
                       <a:fillRect/>
                     </a:stretch>
@@ -585,7 +585,7 @@
                     <pic:cNvPicPr/>
                   </pic:nvPicPr>
                   <pic:blipFill>
-                    <a:blip r:embed="rId13"/>
+                    <a:blip r:embed="rId14"/>
                     <a:stretch>
                       <a:fillRect/>
                     </a:stretch>
@@ -619,6 +619,76 @@
           <w:tab w:val="left" w:pos="2480"/>
         </w:tabs>
       </w:pPr>
+      <w:r>
+        <w:lastRenderedPageBreak/>
+        <w:t xml:space="preserve">Dodanie efektu </w:t>
+      </w:r>
+      <w:proofErr w:type="spellStart"/>
+      <w:r>
+        <w:t>hover</w:t>
+      </w:r>
+      <w:proofErr w:type="spellEnd"/>
+      <w:r>
+        <w:t xml:space="preserve"> do przycisków w menu:</w:t>
+      </w:r>
+    </w:p>
+    <w:p>
+      <w:pPr>
+        <w:tabs>
+          <w:tab w:val="left" w:pos="2480"/>
+        </w:tabs>
+      </w:pPr>
+      <w:r>
+        <w:drawing>
+          <wp:inline distT="0" distB="0" distL="0" distR="0" wp14:anchorId="620C2375" wp14:editId="06B92868">
+            <wp:extent cx="2730640" cy="1358970"/>
+            <wp:effectExtent l="0" t="0" r="0" b="0"/>
+            <wp:docPr id="613331411" name="Obraz 1"/>
+            <wp:cNvGraphicFramePr>
+              <a:graphicFrameLocks xmlns:a="http://schemas.openxmlformats.org/drawingml/2006/main" noChangeAspect="1"/>
+            </wp:cNvGraphicFramePr>
+            <a:graphic xmlns:a="http://schemas.openxmlformats.org/drawingml/2006/main">
+              <a:graphicData uri="http://schemas.openxmlformats.org/drawingml/2006/picture">
+                <pic:pic xmlns:pic="http://schemas.openxmlformats.org/drawingml/2006/picture">
+                  <pic:nvPicPr>
+                    <pic:cNvPr id="613331411" name=""/>
+                    <pic:cNvPicPr/>
+                  </pic:nvPicPr>
+                  <pic:blipFill>
+                    <a:blip r:embed="rId15"/>
+                    <a:stretch>
+                      <a:fillRect/>
+                    </a:stretch>
+                  </pic:blipFill>
+                  <pic:spPr>
+                    <a:xfrm>
+                      <a:off x="0" y="0"/>
+                      <a:ext cx="2730640" cy="1358970"/>
+                    </a:xfrm>
+                    <a:prstGeom prst="rect">
+                      <a:avLst/>
+                    </a:prstGeom>
+                  </pic:spPr>
+                </pic:pic>
+              </a:graphicData>
+            </a:graphic>
+          </wp:inline>
+        </w:drawing>
+      </w:r>
+    </w:p>
+    <w:p>
+      <w:pPr>
+        <w:tabs>
+          <w:tab w:val="left" w:pos="2480"/>
+        </w:tabs>
+      </w:pPr>
+    </w:p>
+    <w:p>
+      <w:pPr>
+        <w:tabs>
+          <w:tab w:val="left" w:pos="2480"/>
+        </w:tabs>
+      </w:pPr>
     </w:p>
     <w:sectPr>
       <w:pgSz w:w="11906" w:h="16838"/>
@@ -628,6 +698,10 @@
     </w:sectPr>
   </w:body>
 </w:document>
+</file>
+
+<file path=word/numbering.xml><?xml version="1.0" encoding="utf-8"?>
+<w:numbering xmlns:wpc="http://schemas.microsoft.com/office/word/2010/wordprocessingCanvas" xmlns:cx="http://schemas.microsoft.com/office/drawing/2014/chartex" xmlns:cx1="http://schemas.microsoft.com/office/drawing/2015/9/8/chartex" xmlns:cx2="http://schemas.microsoft.com/office/drawing/2015/10/21/chartex" xmlns:cx3="http://schemas.microsoft.com/office/drawing/2016/5/9/chartex" xmlns:cx4="http://schemas.microsoft.com/office/drawing/2016/5/10/chartex" xmlns:cx5="http://schemas.microsoft.com/office/drawing/2016/5/11/chartex" xmlns:cx6="http://schemas.microsoft.com/office/drawing/2016/5/12/chartex" xmlns:cx7="http://schemas.microsoft.com/office/drawing/2016/5/13/chartex" xmlns:cx8="http://schemas.microsoft.com/office/drawing/2016/5/14/chartex" xmlns:mc="http://schemas.openxmlformats.org/markup-compatibility/2006" xmlns:aink="http://schemas.microsoft.com/office/drawing/2016/ink" xmlns:am3d="http://schemas.microsoft.com/office/drawing/2017/model3d" xmlns:o="urn:schemas-microsoft-com:office:office" xmlns:oel="http://schemas.microsoft.com/office/2019/extlst" xmlns:r="http://schemas.openxmlformats.org/officeDocument/2006/relationships" xmlns:m="http://schemas.openxmlformats.org/officeDocument/2006/math" xmlns:v="urn:schemas-microsoft-com:vml" xmlns:wp14="http://schemas.microsoft.com/office/word/2010/wordprocessingDrawing" xmlns:wp="http://schemas.openxmlformats.org/drawingml/2006/wordprocessingDrawing" xmlns:w10="urn:schemas-microsoft-com:office:word" xmlns:w="http://schemas.openxmlformats.org/wordprocessingml/2006/main" xmlns:w14="http://schemas.microsoft.com/office/word/2010/wordml" xmlns:w15="http://schemas.microsoft.com/office/word/2012/wordml" xmlns:w16cex="http://schemas.microsoft.com/office/word/2018/wordml/cex" xmlns:w16cid="http://schemas.microsoft.com/office/word/2016/wordml/cid" xmlns:w16="http://schemas.microsoft.com/office/word/2018/wordml" xmlns:w16du="http://schemas.microsoft.com/office/word/2023/wordml/word16du" xmlns:w16sdtdh="http://schemas.microsoft.com/office/word/2020/wordml/sdtdatahash" xmlns:w16sdtfl="http://schemas.microsoft.com/office/word/2024/wordml/sdtformatlock" xmlns:w16se="http://schemas.microsoft.com/office/word/2015/wordml/symex" xmlns:wpg="http://schemas.microsoft.com/office/word/2010/wordprocessingGroup" xmlns:wpi="http://schemas.microsoft.com/office/word/2010/wordprocessingInk" xmlns:wne="http://schemas.microsoft.com/office/word/2006/wordml" xmlns:wps="http://schemas.microsoft.com/office/word/2010/wordprocessingShape" mc:Ignorable="w14 w15 w16se w16cid w16 w16cex w16sdtdh w16sdtfl w16du wp14"/>
 </file>
 
 <file path=word/styles.xml><?xml version="1.0" encoding="utf-8"?>

</xml_diff>

<commit_message>
Informacja o ukończeniu projektu
</commit_message>
<xml_diff>
--- a/Projekt dynamicznej strony HTML i CSS.docx
+++ b/Projekt dynamicznej strony HTML i CSS.docx
@@ -709,29 +709,12 @@
       <w:r>
         <w:br w:type="page"/>
       </w:r>
-    </w:p>
-    <w:p>
-      <w:pPr>
-        <w:tabs>
-          <w:tab w:val="left" w:pos="2480"/>
-        </w:tabs>
-      </w:pPr>
-    </w:p>
-    <w:p>
-      <w:pPr>
-        <w:tabs>
-          <w:tab w:val="left" w:pos="2480"/>
-        </w:tabs>
-      </w:pPr>
-    </w:p>
-    <w:p>
-      <w:pPr>
-        <w:tabs>
-          <w:tab w:val="left" w:pos="2480"/>
-        </w:tabs>
-      </w:pPr>
-      <w:r>
-        <w:t>Dodanie media:</w:t>
+      <w:r>
+        <w:lastRenderedPageBreak/>
+        <w:t>Dodanie media</w:t>
+      </w:r>
+      <w:r>
+        <w:t xml:space="preserve"> query dla urządzeń mobilnych</w:t>
       </w:r>
     </w:p>
     <w:p>
@@ -766,6 +749,72 @@
                     <a:xfrm>
                       <a:off x="0" y="0"/>
                       <a:ext cx="5731510" cy="3541395"/>
+                    </a:xfrm>
+                    <a:prstGeom prst="rect">
+                      <a:avLst/>
+                    </a:prstGeom>
+                  </pic:spPr>
+                </pic:pic>
+              </a:graphicData>
+            </a:graphic>
+          </wp:inline>
+        </w:drawing>
+      </w:r>
+    </w:p>
+    <w:p>
+      <w:r>
+        <w:br w:type="page"/>
+      </w:r>
+    </w:p>
+    <w:p>
+      <w:pPr>
+        <w:tabs>
+          <w:tab w:val="left" w:pos="2480"/>
+        </w:tabs>
+      </w:pPr>
+      <w:r>
+        <w:lastRenderedPageBreak/>
+        <w:t>Wykonanie pull request</w:t>
+      </w:r>
+      <w:r>
+        <w:t xml:space="preserve"> z brancha develop na ma</w:t>
+      </w:r>
+      <w:r>
+        <w:t>in</w:t>
+      </w:r>
+    </w:p>
+    <w:p>
+      <w:pPr>
+        <w:tabs>
+          <w:tab w:val="left" w:pos="2480"/>
+        </w:tabs>
+      </w:pPr>
+      <w:r>
+        <w:drawing>
+          <wp:inline distT="0" distB="0" distL="0" distR="0" wp14:anchorId="7CCEC452" wp14:editId="17F2B443">
+            <wp:extent cx="5731510" cy="4665345"/>
+            <wp:effectExtent l="0" t="0" r="2540" b="1905"/>
+            <wp:docPr id="1502058008" name="Obraz 1"/>
+            <wp:cNvGraphicFramePr>
+              <a:graphicFrameLocks xmlns:a="http://schemas.openxmlformats.org/drawingml/2006/main" noChangeAspect="1"/>
+            </wp:cNvGraphicFramePr>
+            <a:graphic xmlns:a="http://schemas.openxmlformats.org/drawingml/2006/main">
+              <a:graphicData uri="http://schemas.openxmlformats.org/drawingml/2006/picture">
+                <pic:pic xmlns:pic="http://schemas.openxmlformats.org/drawingml/2006/picture">
+                  <pic:nvPicPr>
+                    <pic:cNvPr id="1502058008" name=""/>
+                    <pic:cNvPicPr/>
+                  </pic:nvPicPr>
+                  <pic:blipFill>
+                    <a:blip r:embed="rId18"/>
+                    <a:stretch>
+                      <a:fillRect/>
+                    </a:stretch>
+                  </pic:blipFill>
+                  <pic:spPr>
+                    <a:xfrm>
+                      <a:off x="0" y="0"/>
+                      <a:ext cx="5731510" cy="4665345"/>
                     </a:xfrm>
                     <a:prstGeom prst="rect">
                       <a:avLst/>

</xml_diff>